<commit_message>
Implement retention systems and refresh launch readiness docs
</commit_message>
<xml_diff>
--- a/DUNGEON_DIVE_APP_NEEDS_2026-04-08.docx
+++ b/DUNGEON_DIVE_APP_NEEDS_2026-04-08.docx
@@ -1,141 +1,135 @@
-
-<file path=docProps\app.xml><?xml version="1.0" encoding="utf-8"?>
-<Properties xmlns="http://schemas.openxmlformats.org/officeDocument/2006/extended-properties" xmlns:vt="http://schemas.openxmlformats.org/officeDocument/2006/docPropsVTypes">
-  <Application>Codex</Application>
-</Properties>
-</file>
-
-<file path=docProps\core.xml><?xml version="1.0" encoding="utf-8"?>
-<cp:coreProperties xmlns:cp="http://schemas.openxmlformats.org/package/2006/metadata/core-properties" xmlns:dc="http://purl.org/dc/elements/1.1/" xmlns:dcterms="http://purl.org/dc/terms/" xmlns:dcmitype="http://purl.org/dc/dcmitype/" xmlns:xsi="http://www.w3.org/2001/XMLSchema-instance">
-  <dc:title>Dungeon Dive: Bad Decisions - App Needs - April 8 2026</dc:title>
-  <dc:creator>Codex</dc:creator>
-  <cp:lastModifiedBy>Codex</cp:lastModifiedBy>
-  <dcterms:created xsi:type="dcterms:W3CDTF">2026-04-08T13:01:23Z</dcterms:created>
-  <dcterms:modified xsi:type="dcterms:W3CDTF">2026-04-08T13:01:23Z</dcterms:modified>
-</cp:coreProperties>
-</file>
 
 <file path=word\document.xml><?xml version="1.0" encoding="utf-8"?>
 <w:document xmlns:wpc="http://schemas.microsoft.com/office/word/2010/wordprocessingCanvas" xmlns:mc="http://schemas.openxmlformats.org/markup-compatibility/2006" xmlns:o="urn:schemas-microsoft-com:office:office" xmlns:r="http://schemas.openxmlformats.org/officeDocument/2006/relationships" xmlns:m="http://schemas.openxmlformats.org/officeDocument/2006/math" xmlns:v="urn:schemas-microsoft-com:vml" xmlns:wp14="http://schemas.microsoft.com/office/word/2010/wordprocessingDrawing" xmlns:wp="http://schemas.openxmlformats.org/drawingml/2006/wordprocessingDrawing" xmlns:w10="urn:schemas-microsoft-com:office:word" xmlns:w="http://schemas.openxmlformats.org/wordprocessingml/2006/main" xmlns:w14="http://schemas.microsoft.com/office/word/2010/wordml" xmlns:wpg="http://schemas.microsoft.com/office/word/2010/wordprocessingGroup" xmlns:wpi="http://schemas.microsoft.com/office/word/2010/wordprocessingInk" xmlns:wne="http://schemas.microsoft.com/office/2006/wordml" xmlns:wps="http://schemas.microsoft.com/office/word/2010/wordprocessingShape" mc:Ignorable="w14 wp14">
   <w:body>
     <w:p>
       <w:r>
-        <w:t xml:space="preserve">Dungeon Dive: Bad Decisions - App Needs - April 8 2026</w:t>
+        <w:t xml:space="preserve">Dungeon Dive: Bad Decisions</w:t>
       </w:r>
     </w:p>
     <w:p>
       <w:r>
-        <w:t xml:space="preserve">Current app needs for first release as of April 8, 2026.</w:t>
+        <w:t xml:space="preserve">APP NEEDS - April 8, 2026</w:t>
       </w:r>
     </w:p>
     <w:p/>
     <w:p>
       <w:r>
-        <w:t xml:space="preserve">Scope assumptions:</w:t>
+        <w:t xml:space="preserve">Current status</w:t>
       </w:r>
     </w:p>
     <w:p>
       <w:r>
-        <w:t xml:space="preserve">- Monetization and live-ops systems remain future-state work, not first-release blockers.</w:t>
+        <w:t xml:space="preserve">The project is in release-candidate hardening mode. Retention systems are implemented, but launch-proof and pricing honesty still need outside validation before go-live.</w:t>
       </w:r>
     </w:p>
     <w:p>
       <w:r>
-        <w:t xml:space="preserve">- The game ships as an offline-first Android single-player release.</w:t>
+        <w:t xml:space="preserve">Current tester APK: C:\ddbd\release\dungeon-dive-bad-decisions-android-tester-2026-04-08.apk</w:t>
+      </w:r>
+    </w:p>
+    <w:p>
+      <w:r>
+        <w:t xml:space="preserve">Canonical release APK path: C:\ddbd\android\app\build\outputs\apk\release\app-release.apk</w:t>
       </w:r>
     </w:p>
     <w:p/>
     <w:p>
       <w:r>
-        <w:t xml:space="preserve">Must-finish before the next external tester or release candidate handoff:</w:t>
+        <w:t xml:space="preserve">Must be true before launch</w:t>
       </w:r>
     </w:p>
     <w:p>
       <w:r>
-        <w:t xml:space="preserve">1. Build a fresh Android release/tester APK from the current April 8 source tree.</w:t>
+        <w:t xml:space="preserve">Pacing, post-first-win replay pull, and long-tail retention must be proven strong enough to justify a premium US$3.99 launch. If not, revisit a free route with optional paid upgrades, future games, or extras.</w:t>
       </w:r>
     </w:p>
     <w:p>
       <w:r>
-        <w:t xml:space="preserve">2. Run Android sanity coverage for title -&gt; onboarding -&gt; class-select -&gt; companion-select -&gt; run-map -&gt; battle -&gt; reward/event -&gt; cold relaunch resume -&gt; end-run.</w:t>
+        <w:t xml:space="preserve">Outside guided testers must be able to install the build, finish the opening flow, and explain why they would play again right after a run recap.</w:t>
       </w:r>
     </w:p>
     <w:p>
       <w:r>
-        <w:t xml:space="preserve">3. Confirm the support inbox and public support URL.</w:t>
-      </w:r>
-    </w:p>
-    <w:p>
-      <w:r>
-        <w:t xml:space="preserve">4. Confirm the hosted privacy-policy URL for Play submission.</w:t>
-      </w:r>
-    </w:p>
-    <w:p>
-      <w:r>
-        <w:t xml:space="preserve">5. Finalize Google Play listing copy, screenshots, icon/feature graphic, and Data safety answers.</w:t>
+        <w:t xml:space="preserve">The hardest important path must be proven on real hardware: title -&gt; onboarding -&gt; class select -&gt; companion select -&gt; run map -&gt; battle -&gt; reward or event -&gt; archive recap -&gt; progression.</w:t>
       </w:r>
     </w:p>
     <w:p/>
     <w:p>
       <w:r>
-        <w:t xml:space="preserve">Strongly recommended before launch but acceptable to keep partial if explicitly deferred:</w:t>
+        <w:t xml:space="preserve">Immediate blockers / open decisions</w:t>
       </w:r>
     </w:p>
     <w:p>
       <w:r>
-        <w:t xml:space="preserve">1. Decide whether hardware controller input is a launch requirement or a post-launch accessibility milestone.</w:t>
+        <w:t xml:space="preserve">Complete a full physical-device release-build sanity pass through reward, event resolution, resume, and end-run.</w:t>
       </w:r>
     </w:p>
     <w:p>
       <w:r>
-        <w:t xml:space="preserve">2. Decide whether the remote analytics adapter remains dev-only for first release or is connected to a real backend.</w:t>
+        <w:t xml:space="preserve">Finalize the launch monitoring stance: verified production analytics/crash visibility or a deliberate low-data launch plan.</w:t>
       </w:r>
     </w:p>
     <w:p>
       <w:r>
-        <w:t xml:space="preserve">3. Re-run outside smoke tests after the April 8 controls/combat/analytics changes are in a fresh APK.</w:t>
+        <w:t xml:space="preserve">Finalize support/privacy/store assets and confirm every public-facing claim matches the real shipped loop.</w:t>
+      </w:r>
+    </w:p>
+    <w:p>
+      <w:r>
+        <w:t xml:space="preserve">Decide whether hardware controller support is explicitly post-launch or a release blocker.</w:t>
+      </w:r>
+    </w:p>
+    <w:p>
+      <w:r>
+        <w:t xml:space="preserve">Name the first 10 to 50 outside testers or buyers and how they will hear about the game.</w:t>
       </w:r>
     </w:p>
     <w:p/>
     <w:p>
       <w:r>
-        <w:t xml:space="preserve">Current non-blocking partials that should be tracked honestly:</w:t>
+        <w:t xml:space="preserve">Already implemented in runtime</w:t>
       </w:r>
     </w:p>
     <w:p>
       <w:r>
-        <w:t xml:space="preserve">- Battle now includes dodge and remappable action order, but the game is still fundamentally turn-based.</w:t>
+        <w:t xml:space="preserve">Truth ladder: discovered endings and per-class Full Exposure progress.</w:t>
       </w:r>
     </w:p>
     <w:p>
       <w:r>
-        <w:t xml:space="preserve">- Controller-style hints exist, but actual hardware controller input is not implemented yet.</w:t>
+        <w:t xml:space="preserve">Roster ladder: win subsidies, bonus chits, and next-affordable unlock momentum.</w:t>
       </w:r>
     </w:p>
     <w:p>
       <w:r>
-        <w:t xml:space="preserve">- Remote analytics validation exists in dev builds, but no production vendor has been chosen or proven.</w:t>
+        <w:t xml:space="preserve">Relationship ladder: bond scenes, archived pairings, and companion archive coverage.</w:t>
+      </w:r>
+    </w:p>
+    <w:p>
+      <w:r>
+        <w:t xml:space="preserve">Quarterly score, tier unlocks, optional probation contracts, and quick-clear momentum bonuses.</w:t>
+      </w:r>
+    </w:p>
+    <w:p>
+      <w:r>
+        <w:t xml:space="preserve">Class truth-route framing across class select, next-goal, progression, hub, and end-run recap.</w:t>
       </w:r>
     </w:p>
     <w:p/>
     <w:p>
       <w:r>
-        <w:t xml:space="preserve">Do not expand scope before first release:</w:t>
+        <w:t xml:space="preserve">Post-launch only, not launch blockers</w:t>
       </w:r>
     </w:p>
     <w:p>
       <w:r>
-        <w:t xml:space="preserve">- No new monetization systems.</w:t>
+        <w:t xml:space="preserve">Management Track alternate mode unlocked by Full Exposure.</w:t>
       </w:r>
     </w:p>
     <w:p>
       <w:r>
-        <w:t xml:space="preserve">- No live-ops systems.</w:t>
-      </w:r>
-    </w:p>
-    <w:p>
-      <w:r>
-        <w:t xml:space="preserve">- No broad feature growth outside blocker fixes, packaging, release compliance, and tester-driven corrections.</w:t>
+        <w:t xml:space="preserve">Quarterly roadmap: Q1 proof dossier, Q2 throughput sabotage, Q3 board leak, Q4 aftermath/counteroffensive.</w:t>
       </w:r>
     </w:p>
     <w:sectPr>

</xml_diff>